<commit_message>
feat: add print report functionality with translations and PDF generation
</commit_message>
<xml_diff>
--- a/docs/client/maquette-commerciale.docx
+++ b/docs/client/maquette-commerciale.docx
@@ -70,7 +70,27 @@
           <w:sz w:val="26"/>
           <w:szCs w:val="26"/>
         </w:rPr>
-        <w:t xml:space="preserve">Patients, séances, dossier médical, stock, facturation et préparation à la greffe rénale : un seul outil, pour tous les métiers de votre centre.</w:t>
+        <w:t xml:space="preserve">Patients, séances, dossier médical, stock, facturation, greffe rénale — et un </w:t>
+      </w:r>
+      <w:r>
+        <w:rPr>
+          <w:rFonts w:ascii="Calibri" w:cs="Calibri" w:eastAsia="Calibri" w:hAnsi="Calibri"/>
+          <w:b/>
+          <w:bCs/>
+          <w:color w:val="5B6B75"/>
+          <w:sz w:val="26"/>
+          <w:szCs w:val="26"/>
+        </w:rPr>
+        <w:t xml:space="preserve">tableau de bord de direction en temps réel</w:t>
+      </w:r>
+      <w:r>
+        <w:rPr>
+          <w:rFonts w:ascii="Calibri" w:cs="Calibri" w:eastAsia="Calibri" w:hAnsi="Calibri"/>
+          <w:color w:val="5B6B75"/>
+          <w:sz w:val="26"/>
+          <w:szCs w:val="26"/>
+        </w:rPr>
+        <w:t xml:space="preserve"> pour piloter tous vos centres et décider sur des chiffres fiables.</w:t>
       </w:r>
     </w:p>
     <w:p>
@@ -81,9 +101,9 @@
       <w:r>
         <w:drawing>
           <wp:inline distT="0" distB="0" distL="0" distR="0">
-            <wp:extent cx="4114800" cy="2857500"/>
+            <wp:extent cx="4762500" cy="2857500"/>
             <wp:effectExtent t="0" r="0" b="0" l="0"/>
-            <wp:docPr id="1" name="img/01-dashboard.png" descr="img/01-dashboard.png" title="img/01-dashboard.png"/>
+            <wp:docPr id="1" name="img/90-direction-dashboard.png" descr="img/90-direction-dashboard.png" title="img/90-direction-dashboard.png"/>
             <wp:cNvGraphicFramePr>
               <a:graphicFrameLocks xmlns:a="http://schemas.openxmlformats.org/drawingml/2006/main" noChangeAspect="1"/>
             </wp:cNvGraphicFramePr>
@@ -106,7 +126,7 @@
                   <pic:spPr bwMode="auto">
                     <a:xfrm>
                       <a:off x="0" y="0"/>
-                      <a:ext cx="4114800" cy="2857500"/>
+                      <a:ext cx="4762500" cy="2857500"/>
                     </a:xfrm>
                     <a:prstGeom prst="rect">
                       <a:avLst/>
@@ -221,7 +241,7 @@
         <w:rPr>
           <w:rFonts w:ascii="Calibri" w:cs="Calibri" w:eastAsia="Calibri" w:hAnsi="Calibri"/>
         </w:rPr>
-        <w:t xml:space="preserve">Une visibilité limitée</w:t>
+        <w:t xml:space="preserve">Une direction sans visibilité</w:t>
       </w:r>
     </w:p>
     <w:p>
@@ -234,7 +254,7 @@
           <w:sz w:val="22"/>
           <w:szCs w:val="22"/>
         </w:rPr>
-        <w:t xml:space="preserve">Difficile de relier une consommation à un patient, une séance et une facture.</w:t>
+        <w:t xml:space="preserve">Comparer les centres, suivre l'encaissement et la qualité des soins demande des consolidations manuelles, toujours en retard.</w:t>
       </w:r>
     </w:p>
     <w:p>
@@ -521,6 +541,803 @@
           <w:szCs w:val="22"/>
         </w:rPr>
         <w:t xml:space="preserve">Journal SCF automatique</w:t>
+      </w:r>
+    </w:p>
+    <w:p>
+      <w:pPr>
+        <w:keepNext/>
+        <w:spacing w:after="40" w:before="120"/>
+      </w:pPr>
+      <w:r>
+        <w:rPr>
+          <w:rFonts w:ascii="Calibri" w:cs="Calibri" w:eastAsia="Calibri" w:hAnsi="Calibri"/>
+          <w:b/>
+          <w:bCs/>
+          <w:color w:val="0D5750"/>
+          <w:sz w:val="24"/>
+          <w:szCs w:val="24"/>
+        </w:rPr>
+        <w:t xml:space="preserve">Pilotage direction</w:t>
+      </w:r>
+    </w:p>
+    <w:p>
+      <w:pPr>
+        <w:spacing w:after="100"/>
+      </w:pPr>
+      <w:r>
+        <w:rPr>
+          <w:rFonts w:ascii="Calibri" w:cs="Calibri" w:eastAsia="Calibri" w:hAnsi="Calibri"/>
+          <w:sz w:val="22"/>
+          <w:szCs w:val="22"/>
+        </w:rPr>
+        <w:t xml:space="preserve">Tableau de bord temps réel, multi-centres</w:t>
+      </w:r>
+    </w:p>
+    <w:p>
+      <w:pPr>
+        <w:pageBreakBefore/>
+      </w:pPr>
+    </w:p>
+    <w:p>
+      <w:pPr>
+        <w:spacing w:after="40" w:before="120"/>
+      </w:pPr>
+      <w:r>
+        <w:rPr>
+          <w:rFonts w:ascii="Calibri" w:cs="Calibri" w:eastAsia="Calibri" w:hAnsi="Calibri"/>
+          <w:b/>
+          <w:bCs/>
+          <w:color w:val="14766E"/>
+          <w:sz w:val="20"/>
+          <w:szCs w:val="20"/>
+        </w:rPr>
+        <w:t xml:space="preserve">Pilotage de la direction</w:t>
+      </w:r>
+    </w:p>
+    <w:p>
+      <w:pPr>
+        <w:pStyle w:val="Heading1"/>
+      </w:pPr>
+      <w:r>
+        <w:rPr>
+          <w:rFonts w:ascii="Calibri" w:cs="Calibri" w:eastAsia="Calibri" w:hAnsi="Calibri"/>
+        </w:rPr>
+        <w:t xml:space="preserve">Toute votre activité sur un seul écran, à jour à la seconde.</w:t>
+      </w:r>
+    </w:p>
+    <w:p>
+      <w:pPr>
+        <w:spacing w:after="140"/>
+      </w:pPr>
+      <w:r>
+        <w:rPr>
+          <w:rFonts w:ascii="Calibri" w:cs="Calibri" w:eastAsia="Calibri" w:hAnsi="Calibri"/>
+          <w:color w:val="5B6B75"/>
+          <w:sz w:val="26"/>
+          <w:szCs w:val="26"/>
+        </w:rPr>
+        <w:t xml:space="preserve">Activité, chiffre d'affaires, encaissement, qualité des soins et stock de </w:t>
+      </w:r>
+      <w:r>
+        <w:rPr>
+          <w:rFonts w:ascii="Calibri" w:cs="Calibri" w:eastAsia="Calibri" w:hAnsi="Calibri"/>
+          <w:b/>
+          <w:bCs/>
+          <w:color w:val="5B6B75"/>
+          <w:sz w:val="26"/>
+          <w:szCs w:val="26"/>
+        </w:rPr>
+        <w:t xml:space="preserve">tous vos centres</w:t>
+      </w:r>
+      <w:r>
+        <w:rPr>
+          <w:rFonts w:ascii="Calibri" w:cs="Calibri" w:eastAsia="Calibri" w:hAnsi="Calibri"/>
+          <w:color w:val="5B6B75"/>
+          <w:sz w:val="26"/>
+          <w:szCs w:val="26"/>
+        </w:rPr>
+        <w:t xml:space="preserve">, comparés côte à côte. Vous voyez où agir avant que le problème ne se voie dans les résultats.</w:t>
+      </w:r>
+    </w:p>
+    <w:tbl>
+      <w:tblPr>
+        <w:tblW w:type="dxa" w:w="14800"/>
+        <w:tblBorders>
+          <w:top w:val="none"/>
+          <w:left w:val="none"/>
+          <w:bottom w:val="none"/>
+          <w:right w:val="none"/>
+          <w:insideH w:val="none"/>
+          <w:insideV w:val="none"/>
+        </w:tblBorders>
+      </w:tblPr>
+      <w:tblGrid>
+        <w:gridCol w:w="7400"/>
+        <w:gridCol w:w="7400"/>
+      </w:tblGrid>
+      <w:tr>
+        <w:tc>
+          <w:tcPr>
+            <w:tcW w:type="dxa" w:w="7400"/>
+            <w:tcBorders>
+              <w:top w:val="none"/>
+              <w:left w:val="none"/>
+              <w:bottom w:val="none"/>
+              <w:right w:val="none"/>
+            </w:tcBorders>
+            <w:tcMar>
+              <w:top w:type="dxa" w:w="60"/>
+              <w:left w:type="dxa" w:w="60"/>
+              <w:bottom w:type="dxa" w:w="60"/>
+              <w:right w:type="dxa" w:w="60"/>
+            </w:tcMar>
+          </w:tcPr>
+          <w:p>
+            <w:pPr>
+              <w:spacing w:after="40" w:before="80"/>
+              <w:jc w:val="center"/>
+            </w:pPr>
+            <w:r>
+              <w:drawing>
+                <wp:inline distT="0" distB="0" distL="0" distR="0">
+                  <wp:extent cx="3619500" cy="2171700"/>
+                  <wp:effectExtent t="0" r="0" b="0" l="0"/>
+                  <wp:docPr id="1" name="img/90-direction-dashboard.png" descr="img/90-direction-dashboard.png" title="img/90-direction-dashboard.png"/>
+                  <wp:cNvGraphicFramePr>
+                    <a:graphicFrameLocks xmlns:a="http://schemas.openxmlformats.org/drawingml/2006/main" noChangeAspect="1"/>
+                  </wp:cNvGraphicFramePr>
+                  <a:graphic xmlns:a="http://schemas.openxmlformats.org/drawingml/2006/main">
+                    <a:graphicData uri="http://schemas.openxmlformats.org/drawingml/2006/picture">
+                      <pic:pic xmlns:pic="http://schemas.openxmlformats.org/drawingml/2006/picture">
+                        <pic:nvPicPr>
+                          <pic:cNvPr id="0" name="" descr=""/>
+                          <pic:cNvPicPr>
+                            <a:picLocks noChangeAspect="1" noChangeArrowheads="1"/>
+                          </pic:cNvPicPr>
+                        </pic:nvPicPr>
+                        <pic:blipFill>
+                          <a:blip r:embed="rId8" cstate="none"/>
+                          <a:srcRect/>
+                          <a:stretch>
+                            <a:fillRect/>
+                          </a:stretch>
+                        </pic:blipFill>
+                        <pic:spPr bwMode="auto">
+                          <a:xfrm>
+                            <a:off x="0" y="0"/>
+                            <a:ext cx="3619500" cy="2171700"/>
+                          </a:xfrm>
+                          <a:prstGeom prst="rect">
+                            <a:avLst/>
+                          </a:prstGeom>
+                        </pic:spPr>
+                      </pic:pic>
+                    </a:graphicData>
+                  </a:graphic>
+                </wp:inline>
+              </w:drawing>
+            </w:r>
+          </w:p>
+        </w:tc>
+        <w:tc>
+          <w:tcPr>
+            <w:tcW w:type="dxa" w:w="7400"/>
+            <w:tcBorders>
+              <w:top w:val="none"/>
+              <w:left w:val="none"/>
+              <w:bottom w:val="none"/>
+              <w:right w:val="none"/>
+            </w:tcBorders>
+            <w:tcMar>
+              <w:top w:type="dxa" w:w="60"/>
+              <w:left w:type="dxa" w:w="60"/>
+              <w:bottom w:type="dxa" w:w="60"/>
+              <w:right w:type="dxa" w:w="60"/>
+            </w:tcMar>
+          </w:tcPr>
+          <w:p>
+            <w:r>
+              <w:t xml:space="preserve"/>
+            </w:r>
+          </w:p>
+        </w:tc>
+      </w:tr>
+    </w:tbl>
+    <w:p>
+      <w:pPr>
+        <w:spacing w:after="120"/>
+      </w:pPr>
+    </w:p>
+    <w:p>
+      <w:pPr>
+        <w:pStyle w:val="ListParagraph"/>
+        <w:numPr>
+          <w:ilvl w:val="0"/>
+          <w:numId w:val="2"/>
+        </w:numPr>
+        <w:spacing w:after="40"/>
+      </w:pPr>
+      <w:r>
+        <w:rPr>
+          <w:rFonts w:ascii="Calibri" w:cs="Calibri" w:eastAsia="Calibri" w:hAnsi="Calibri"/>
+          <w:b/>
+          <w:bCs/>
+          <w:sz w:val="22"/>
+          <w:szCs w:val="22"/>
+        </w:rPr>
+        <w:t xml:space="preserve">Indicateurs clés</w:t>
+      </w:r>
+      <w:r>
+        <w:rPr>
+          <w:rFonts w:ascii="Calibri" w:cs="Calibri" w:eastAsia="Calibri" w:hAnsi="Calibri"/>
+          <w:sz w:val="22"/>
+          <w:szCs w:val="22"/>
+        </w:rPr>
+        <w:t xml:space="preserve"> : patients, séances, CA HT / TTC, encaissé, reste à recouvrer</w:t>
+      </w:r>
+    </w:p>
+    <w:p>
+      <w:pPr>
+        <w:pStyle w:val="ListParagraph"/>
+        <w:numPr>
+          <w:ilvl w:val="0"/>
+          <w:numId w:val="2"/>
+        </w:numPr>
+        <w:spacing w:after="40"/>
+      </w:pPr>
+      <w:r>
+        <w:rPr>
+          <w:rFonts w:ascii="Calibri" w:cs="Calibri" w:eastAsia="Calibri" w:hAnsi="Calibri"/>
+          <w:b/>
+          <w:bCs/>
+          <w:sz w:val="22"/>
+          <w:szCs w:val="22"/>
+        </w:rPr>
+        <w:t xml:space="preserve">Comparaison des centres</w:t>
+      </w:r>
+      <w:r>
+        <w:rPr>
+          <w:rFonts w:ascii="Calibri" w:cs="Calibri" w:eastAsia="Calibri" w:hAnsi="Calibri"/>
+          <w:sz w:val="22"/>
+          <w:szCs w:val="22"/>
+        </w:rPr>
+        <w:t xml:space="preserve"> et part de chacun dans le chiffre d'affaires</w:t>
+      </w:r>
+    </w:p>
+    <w:p>
+      <w:pPr>
+        <w:pStyle w:val="ListParagraph"/>
+        <w:numPr>
+          <w:ilvl w:val="0"/>
+          <w:numId w:val="2"/>
+        </w:numPr>
+        <w:spacing w:after="40"/>
+      </w:pPr>
+      <w:r>
+        <w:rPr>
+          <w:rFonts w:ascii="Calibri" w:cs="Calibri" w:eastAsia="Calibri" w:hAnsi="Calibri"/>
+          <w:b/>
+          <w:bCs/>
+          <w:sz w:val="22"/>
+          <w:szCs w:val="22"/>
+        </w:rPr>
+        <w:t xml:space="preserve">Alertes classées par gravité</w:t>
+      </w:r>
+      <w:r>
+        <w:rPr>
+          <w:rFonts w:ascii="Calibri" w:cs="Calibri" w:eastAsia="Calibri" w:hAnsi="Calibri"/>
+          <w:sz w:val="22"/>
+          <w:szCs w:val="22"/>
+        </w:rPr>
+        <w:t xml:space="preserve"> : lots périmés, stock bas, traitements en retard</w:t>
+      </w:r>
+    </w:p>
+    <w:p>
+      <w:pPr>
+        <w:pStyle w:val="ListParagraph"/>
+        <w:numPr>
+          <w:ilvl w:val="0"/>
+          <w:numId w:val="2"/>
+        </w:numPr>
+        <w:spacing w:after="40"/>
+      </w:pPr>
+      <w:r>
+        <w:rPr>
+          <w:rFonts w:ascii="Calibri" w:cs="Calibri" w:eastAsia="Calibri" w:hAnsi="Calibri"/>
+          <w:b/>
+          <w:bCs/>
+          <w:sz w:val="22"/>
+          <w:szCs w:val="22"/>
+        </w:rPr>
+        <w:t xml:space="preserve">Tendance mensuelle</w:t>
+      </w:r>
+      <w:r>
+        <w:rPr>
+          <w:rFonts w:ascii="Calibri" w:cs="Calibri" w:eastAsia="Calibri" w:hAnsi="Calibri"/>
+          <w:sz w:val="22"/>
+          <w:szCs w:val="22"/>
+        </w:rPr>
+        <w:t xml:space="preserve"> pour anticiper plutôt que constater</w:t>
+      </w:r>
+    </w:p>
+    <w:p>
+      <w:pPr>
+        <w:pageBreakBefore/>
+      </w:pPr>
+    </w:p>
+    <w:p>
+      <w:pPr>
+        <w:spacing w:after="40" w:before="120"/>
+      </w:pPr>
+      <w:r>
+        <w:rPr>
+          <w:rFonts w:ascii="Calibri" w:cs="Calibri" w:eastAsia="Calibri" w:hAnsi="Calibri"/>
+          <w:b/>
+          <w:bCs/>
+          <w:color w:val="14766E"/>
+          <w:sz w:val="20"/>
+          <w:szCs w:val="20"/>
+        </w:rPr>
+        <w:t xml:space="preserve">Aide à la décision</w:t>
+      </w:r>
+    </w:p>
+    <w:p>
+      <w:pPr>
+        <w:pStyle w:val="Heading1"/>
+      </w:pPr>
+      <w:r>
+        <w:rPr>
+          <w:rFonts w:ascii="Calibri" w:cs="Calibri" w:eastAsia="Calibri" w:hAnsi="Calibri"/>
+        </w:rPr>
+        <w:t xml:space="preserve">Qualité des soins, stock, patients : chaque écart est visible.</w:t>
+      </w:r>
+    </w:p>
+    <w:tbl>
+      <w:tblPr>
+        <w:tblW w:type="dxa" w:w="14800"/>
+        <w:tblBorders>
+          <w:top w:val="none"/>
+          <w:left w:val="none"/>
+          <w:bottom w:val="none"/>
+          <w:right w:val="none"/>
+          <w:insideH w:val="none"/>
+          <w:insideV w:val="none"/>
+        </w:tblBorders>
+      </w:tblPr>
+      <w:tblGrid>
+        <w:gridCol w:w="7400"/>
+        <w:gridCol w:w="7400"/>
+      </w:tblGrid>
+      <w:tr>
+        <w:tc>
+          <w:tcPr>
+            <w:tcW w:type="dxa" w:w="7400"/>
+            <w:tcBorders>
+              <w:top w:val="none"/>
+              <w:left w:val="none"/>
+              <w:bottom w:val="none"/>
+              <w:right w:val="none"/>
+            </w:tcBorders>
+            <w:tcMar>
+              <w:top w:type="dxa" w:w="60"/>
+              <w:left w:type="dxa" w:w="60"/>
+              <w:bottom w:type="dxa" w:w="60"/>
+              <w:right w:type="dxa" w:w="60"/>
+            </w:tcMar>
+          </w:tcPr>
+          <w:p>
+            <w:pPr>
+              <w:spacing w:after="40" w:before="80"/>
+              <w:jc w:val="center"/>
+            </w:pPr>
+            <w:r>
+              <w:drawing>
+                <wp:inline distT="0" distB="0" distL="0" distR="0">
+                  <wp:extent cx="3619500" cy="847725"/>
+                  <wp:effectExtent t="0" r="0" b="0" l="0"/>
+                  <wp:docPr id="1" name="img/91-direction-qualite-stock.png" descr="img/91-direction-qualite-stock.png" title="img/91-direction-qualite-stock.png"/>
+                  <wp:cNvGraphicFramePr>
+                    <a:graphicFrameLocks xmlns:a="http://schemas.openxmlformats.org/drawingml/2006/main" noChangeAspect="1"/>
+                  </wp:cNvGraphicFramePr>
+                  <a:graphic xmlns:a="http://schemas.openxmlformats.org/drawingml/2006/main">
+                    <a:graphicData uri="http://schemas.openxmlformats.org/drawingml/2006/picture">
+                      <pic:pic xmlns:pic="http://schemas.openxmlformats.org/drawingml/2006/picture">
+                        <pic:nvPicPr>
+                          <pic:cNvPr id="0" name="" descr=""/>
+                          <pic:cNvPicPr>
+                            <a:picLocks noChangeAspect="1" noChangeArrowheads="1"/>
+                          </pic:cNvPicPr>
+                        </pic:nvPicPr>
+                        <pic:blipFill>
+                          <a:blip r:embed="rId9" cstate="none"/>
+                          <a:srcRect/>
+                          <a:stretch>
+                            <a:fillRect/>
+                          </a:stretch>
+                        </pic:blipFill>
+                        <pic:spPr bwMode="auto">
+                          <a:xfrm>
+                            <a:off x="0" y="0"/>
+                            <a:ext cx="3619500" cy="847725"/>
+                          </a:xfrm>
+                          <a:prstGeom prst="rect">
+                            <a:avLst/>
+                          </a:prstGeom>
+                        </pic:spPr>
+                      </pic:pic>
+                    </a:graphicData>
+                  </a:graphic>
+                </wp:inline>
+              </w:drawing>
+            </w:r>
+          </w:p>
+        </w:tc>
+        <w:tc>
+          <w:tcPr>
+            <w:tcW w:type="dxa" w:w="7400"/>
+            <w:tcBorders>
+              <w:top w:val="none"/>
+              <w:left w:val="none"/>
+              <w:bottom w:val="none"/>
+              <w:right w:val="none"/>
+            </w:tcBorders>
+            <w:tcMar>
+              <w:top w:type="dxa" w:w="60"/>
+              <w:left w:type="dxa" w:w="60"/>
+              <w:bottom w:type="dxa" w:w="60"/>
+              <w:right w:type="dxa" w:w="60"/>
+            </w:tcMar>
+          </w:tcPr>
+          <w:p>
+            <w:pPr>
+              <w:spacing w:after="40" w:before="80"/>
+              <w:jc w:val="center"/>
+            </w:pPr>
+            <w:r>
+              <w:drawing>
+                <wp:inline distT="0" distB="0" distL="0" distR="0">
+                  <wp:extent cx="3619500" cy="1428750"/>
+                  <wp:effectExtent t="0" r="0" b="0" l="0"/>
+                  <wp:docPr id="1" name="img/92-direction-repartitions.png" descr="img/92-direction-repartitions.png" title="img/92-direction-repartitions.png"/>
+                  <wp:cNvGraphicFramePr>
+                    <a:graphicFrameLocks xmlns:a="http://schemas.openxmlformats.org/drawingml/2006/main" noChangeAspect="1"/>
+                  </wp:cNvGraphicFramePr>
+                  <a:graphic xmlns:a="http://schemas.openxmlformats.org/drawingml/2006/main">
+                    <a:graphicData uri="http://schemas.openxmlformats.org/drawingml/2006/picture">
+                      <pic:pic xmlns:pic="http://schemas.openxmlformats.org/drawingml/2006/picture">
+                        <pic:nvPicPr>
+                          <pic:cNvPr id="0" name="" descr=""/>
+                          <pic:cNvPicPr>
+                            <a:picLocks noChangeAspect="1" noChangeArrowheads="1"/>
+                          </pic:cNvPicPr>
+                        </pic:nvPicPr>
+                        <pic:blipFill>
+                          <a:blip r:embed="rId10" cstate="none"/>
+                          <a:srcRect/>
+                          <a:stretch>
+                            <a:fillRect/>
+                          </a:stretch>
+                        </pic:blipFill>
+                        <pic:spPr bwMode="auto">
+                          <a:xfrm>
+                            <a:off x="0" y="0"/>
+                            <a:ext cx="3619500" cy="1428750"/>
+                          </a:xfrm>
+                          <a:prstGeom prst="rect">
+                            <a:avLst/>
+                          </a:prstGeom>
+                        </pic:spPr>
+                      </pic:pic>
+                    </a:graphicData>
+                  </a:graphic>
+                </wp:inline>
+              </w:drawing>
+            </w:r>
+          </w:p>
+        </w:tc>
+      </w:tr>
+    </w:tbl>
+    <w:p>
+      <w:pPr>
+        <w:spacing w:after="120"/>
+      </w:pPr>
+    </w:p>
+    <w:p>
+      <w:pPr>
+        <w:pStyle w:val="Heading2"/>
+      </w:pPr>
+      <w:r>
+        <w:rPr>
+          <w:rFonts w:ascii="Calibri" w:cs="Calibri" w:eastAsia="Calibri" w:hAnsi="Calibri"/>
+        </w:rPr>
+        <w:t xml:space="preserve">Qualité KDIGO par centre</w:t>
+      </w:r>
+    </w:p>
+    <w:p>
+      <w:pPr>
+        <w:spacing w:after="100"/>
+      </w:pPr>
+      <w:r>
+        <w:rPr>
+          <w:rFonts w:ascii="Calibri" w:cs="Calibri" w:eastAsia="Calibri" w:hAnsi="Calibri"/>
+          <w:sz w:val="22"/>
+          <w:szCs w:val="22"/>
+        </w:rPr>
+        <w:t xml:space="preserve">Part des patients dans la cible (Kt/V, Hb, phosphore, PTH, albumine) en couleurs : repérez le centre qui décroche.</w:t>
+      </w:r>
+    </w:p>
+    <w:p>
+      <w:pPr>
+        <w:pStyle w:val="Heading2"/>
+      </w:pPr>
+      <w:r>
+        <w:rPr>
+          <w:rFonts w:ascii="Calibri" w:cs="Calibri" w:eastAsia="Calibri" w:hAnsi="Calibri"/>
+        </w:rPr>
+        <w:t xml:space="preserve">Qui, et comment c'est financé</w:t>
+      </w:r>
+    </w:p>
+    <w:p>
+      <w:pPr>
+        <w:spacing w:after="100"/>
+      </w:pPr>
+      <w:r>
+        <w:rPr>
+          <w:rFonts w:ascii="Calibri" w:cs="Calibri" w:eastAsia="Calibri" w:hAnsi="Calibri"/>
+          <w:sz w:val="22"/>
+          <w:szCs w:val="22"/>
+        </w:rPr>
+        <w:t xml:space="preserve">Patients par sexe et âge, séances et CA HT par caisse d'assurance, traitement de l'anémie par centre.</w:t>
+      </w:r>
+    </w:p>
+    <w:p>
+      <w:pPr>
+        <w:pStyle w:val="Heading2"/>
+      </w:pPr>
+      <w:r>
+        <w:rPr>
+          <w:rFonts w:ascii="Calibri" w:cs="Calibri" w:eastAsia="Calibri" w:hAnsi="Calibri"/>
+        </w:rPr>
+        <w:t xml:space="preserve">Confidentialité garantie</w:t>
+      </w:r>
+    </w:p>
+    <w:p>
+      <w:pPr>
+        <w:spacing w:after="100"/>
+      </w:pPr>
+      <w:r>
+        <w:rPr>
+          <w:rFonts w:ascii="Calibri" w:cs="Calibri" w:eastAsia="Calibri" w:hAnsi="Calibri"/>
+          <w:sz w:val="22"/>
+          <w:szCs w:val="22"/>
+        </w:rPr>
+        <w:t xml:space="preserve">Données agrégées et anonymes : aucun dossier patient n'est accessible, les petits effectifs sont masqués.</w:t>
+      </w:r>
+    </w:p>
+    <w:p>
+      <w:pPr>
+        <w:pageBreakBefore/>
+      </w:pPr>
+    </w:p>
+    <w:p>
+      <w:pPr>
+        <w:spacing w:after="40" w:before="80"/>
+        <w:jc w:val="center"/>
+      </w:pPr>
+      <w:r>
+        <w:drawing>
+          <wp:inline distT="0" distB="0" distL="0" distR="0">
+            <wp:extent cx="4953000" cy="2162175"/>
+            <wp:effectExtent t="0" r="0" b="0" l="0"/>
+            <wp:docPr id="1" name="img/93-direction-rapport.png" descr="img/93-direction-rapport.png" title="img/93-direction-rapport.png"/>
+            <wp:cNvGraphicFramePr>
+              <a:graphicFrameLocks xmlns:a="http://schemas.openxmlformats.org/drawingml/2006/main" noChangeAspect="1"/>
+            </wp:cNvGraphicFramePr>
+            <a:graphic xmlns:a="http://schemas.openxmlformats.org/drawingml/2006/main">
+              <a:graphicData uri="http://schemas.openxmlformats.org/drawingml/2006/picture">
+                <pic:pic xmlns:pic="http://schemas.openxmlformats.org/drawingml/2006/picture">
+                  <pic:nvPicPr>
+                    <pic:cNvPr id="0" name="" descr=""/>
+                    <pic:cNvPicPr>
+                      <a:picLocks noChangeAspect="1" noChangeArrowheads="1"/>
+                    </pic:cNvPicPr>
+                  </pic:nvPicPr>
+                  <pic:blipFill>
+                    <a:blip r:embed="rId11" cstate="none"/>
+                    <a:srcRect/>
+                    <a:stretch>
+                      <a:fillRect/>
+                    </a:stretch>
+                  </pic:blipFill>
+                  <pic:spPr bwMode="auto">
+                    <a:xfrm>
+                      <a:off x="0" y="0"/>
+                      <a:ext cx="4953000" cy="2162175"/>
+                    </a:xfrm>
+                    <a:prstGeom prst="rect">
+                      <a:avLst/>
+                    </a:prstGeom>
+                  </pic:spPr>
+                </pic:pic>
+              </a:graphicData>
+            </a:graphic>
+          </wp:inline>
+        </w:drawing>
+      </w:r>
+    </w:p>
+    <w:p>
+      <w:pPr>
+        <w:spacing w:after="40" w:before="120"/>
+      </w:pPr>
+      <w:r>
+        <w:rPr>
+          <w:rFonts w:ascii="Calibri" w:cs="Calibri" w:eastAsia="Calibri" w:hAnsi="Calibri"/>
+          <w:b/>
+          <w:bCs/>
+          <w:color w:val="14766E"/>
+          <w:sz w:val="20"/>
+          <w:szCs w:val="20"/>
+        </w:rPr>
+        <w:t xml:space="preserve">Temps réel &amp; rapports</w:t>
+      </w:r>
+    </w:p>
+    <w:p>
+      <w:pPr>
+        <w:pStyle w:val="Heading1"/>
+      </w:pPr>
+      <w:r>
+        <w:rPr>
+          <w:rFonts w:ascii="Calibri" w:cs="Calibri" w:eastAsia="Calibri" w:hAnsi="Calibri"/>
+        </w:rPr>
+        <w:t xml:space="preserve">Notifié à l'instant, prêt pour le conseil d'administration.</w:t>
+      </w:r>
+    </w:p>
+    <w:p>
+      <w:pPr>
+        <w:pStyle w:val="ListParagraph"/>
+        <w:numPr>
+          <w:ilvl w:val="0"/>
+          <w:numId w:val="2"/>
+        </w:numPr>
+        <w:spacing w:after="40"/>
+      </w:pPr>
+      <w:r>
+        <w:rPr>
+          <w:rFonts w:ascii="Calibri" w:cs="Calibri" w:eastAsia="Calibri" w:hAnsi="Calibri"/>
+          <w:b/>
+          <w:bCs/>
+          <w:sz w:val="22"/>
+          <w:szCs w:val="22"/>
+        </w:rPr>
+        <w:t xml:space="preserve">Temps réel</w:t>
+      </w:r>
+      <w:r>
+        <w:rPr>
+          <w:rFonts w:ascii="Calibri" w:cs="Calibri" w:eastAsia="Calibri" w:hAnsi="Calibri"/>
+          <w:sz w:val="22"/>
+          <w:szCs w:val="22"/>
+        </w:rPr>
+        <w:t xml:space="preserve"> : chaque changement met à jour le tableau de bord et déclenche une </w:t>
+      </w:r>
+      <w:r>
+        <w:rPr>
+          <w:rFonts w:ascii="Calibri" w:cs="Calibri" w:eastAsia="Calibri" w:hAnsi="Calibri"/>
+          <w:b/>
+          <w:bCs/>
+          <w:sz w:val="22"/>
+          <w:szCs w:val="22"/>
+        </w:rPr>
+        <w:t xml:space="preserve">notification</w:t>
+      </w:r>
+    </w:p>
+    <w:p>
+      <w:pPr>
+        <w:pStyle w:val="ListParagraph"/>
+        <w:numPr>
+          <w:ilvl w:val="0"/>
+          <w:numId w:val="2"/>
+        </w:numPr>
+        <w:spacing w:after="40"/>
+      </w:pPr>
+      <w:r>
+        <w:rPr>
+          <w:rFonts w:ascii="Calibri" w:cs="Calibri" w:eastAsia="Calibri" w:hAnsi="Calibri"/>
+          <w:b/>
+          <w:bCs/>
+          <w:sz w:val="22"/>
+          <w:szCs w:val="22"/>
+        </w:rPr>
+        <w:t xml:space="preserve">Rapport PDF en un clic</w:t>
+      </w:r>
+      <w:r>
+        <w:rPr>
+          <w:rFonts w:ascii="Calibri" w:cs="Calibri" w:eastAsia="Calibri" w:hAnsi="Calibri"/>
+          <w:sz w:val="22"/>
+          <w:szCs w:val="22"/>
+        </w:rPr>
+        <w:t xml:space="preserve">, à l'en-tête et au pied de page de votre société</w:t>
+      </w:r>
+    </w:p>
+    <w:p>
+      <w:pPr>
+        <w:pStyle w:val="ListParagraph"/>
+        <w:numPr>
+          <w:ilvl w:val="0"/>
+          <w:numId w:val="2"/>
+        </w:numPr>
+        <w:spacing w:after="40"/>
+      </w:pPr>
+      <w:r>
+        <w:rPr>
+          <w:rFonts w:ascii="Calibri" w:cs="Calibri" w:eastAsia="Calibri" w:hAnsi="Calibri"/>
+          <w:sz w:val="22"/>
+          <w:szCs w:val="22"/>
+        </w:rPr>
+        <w:t xml:space="preserve">Toutes les statistiques : finances, qualité, stock, répartitions</w:t>
+      </w:r>
+    </w:p>
+    <w:p>
+      <w:pPr>
+        <w:pStyle w:val="ListParagraph"/>
+        <w:numPr>
+          <w:ilvl w:val="0"/>
+          <w:numId w:val="2"/>
+        </w:numPr>
+        <w:spacing w:after="40"/>
+      </w:pPr>
+      <w:r>
+        <w:rPr>
+          <w:rFonts w:ascii="Calibri" w:cs="Calibri" w:eastAsia="Calibri" w:hAnsi="Calibri"/>
+          <w:b/>
+          <w:bCs/>
+          <w:sz w:val="22"/>
+          <w:szCs w:val="22"/>
+        </w:rPr>
+        <w:t xml:space="preserve">Rapports mensuels figés</w:t>
+      </w:r>
+      <w:r>
+        <w:rPr>
+          <w:rFonts w:ascii="Calibri" w:cs="Calibri" w:eastAsia="Calibri" w:hAnsi="Calibri"/>
+          <w:sz w:val="22"/>
+          <w:szCs w:val="22"/>
+        </w:rPr>
+        <w:t xml:space="preserve"> : des chiffres d'archive qui ne bougent plus</w:t>
+      </w:r>
+    </w:p>
+    <w:p>
+      <w:pPr>
+        <w:pStyle w:val="ListParagraph"/>
+        <w:numPr>
+          <w:ilvl w:val="0"/>
+          <w:numId w:val="2"/>
+        </w:numPr>
+        <w:spacing w:after="40"/>
+      </w:pPr>
+      <w:r>
+        <w:rPr>
+          <w:rFonts w:ascii="Calibri" w:cs="Calibri" w:eastAsia="Calibri" w:hAnsi="Calibri"/>
+          <w:sz w:val="22"/>
+          <w:szCs w:val="22"/>
+        </w:rPr>
+        <w:t xml:space="preserve">Accès sécurisé, </w:t>
+      </w:r>
+      <w:r>
+        <w:rPr>
+          <w:rFonts w:ascii="Calibri" w:cs="Calibri" w:eastAsia="Calibri" w:hAnsi="Calibri"/>
+          <w:b/>
+          <w:bCs/>
+          <w:sz w:val="22"/>
+          <w:szCs w:val="22"/>
+        </w:rPr>
+        <w:t xml:space="preserve">double authentification (2FA)</w:t>
+      </w:r>
+      <w:r>
+        <w:rPr>
+          <w:rFonts w:ascii="Calibri" w:cs="Calibri" w:eastAsia="Calibri" w:hAnsi="Calibri"/>
+          <w:sz w:val="22"/>
+          <w:szCs w:val="22"/>
+        </w:rPr>
+        <w:t xml:space="preserve"> disponible</w:t>
       </w:r>
     </w:p>
     <w:p>
@@ -661,7 +1478,7 @@
                     </pic:cNvPicPr>
                   </pic:nvPicPr>
                   <pic:blipFill>
-                    <a:blip r:embed="rId9" cstate="none"/>
+                    <a:blip r:embed="rId12" cstate="none"/>
                     <a:srcRect/>
                     <a:stretch>
                       <a:fillRect/>
@@ -712,7 +1529,7 @@
                     </pic:cNvPicPr>
                   </pic:nvPicPr>
                   <pic:blipFill>
-                    <a:blip r:embed="rId10" cstate="none"/>
+                    <a:blip r:embed="rId13" cstate="none"/>
                     <a:srcRect/>
                     <a:stretch>
                       <a:fillRect/>
@@ -1083,7 +1900,7 @@
                     </pic:cNvPicPr>
                   </pic:nvPicPr>
                   <pic:blipFill>
-                    <a:blip r:embed="rId11" cstate="none"/>
+                    <a:blip r:embed="rId14" cstate="none"/>
                     <a:srcRect/>
                     <a:stretch>
                       <a:fillRect/>
@@ -1194,7 +2011,7 @@
                           </pic:cNvPicPr>
                         </pic:nvPicPr>
                         <pic:blipFill>
-                          <a:blip r:embed="rId12" cstate="none"/>
+                          <a:blip r:embed="rId15" cstate="none"/>
                           <a:srcRect/>
                           <a:stretch>
                             <a:fillRect/>
@@ -1257,7 +2074,7 @@
                           </pic:cNvPicPr>
                         </pic:nvPicPr>
                         <pic:blipFill>
-                          <a:blip r:embed="rId13" cstate="none"/>
+                          <a:blip r:embed="rId16" cstate="none"/>
                           <a:srcRect/>
                           <a:stretch>
                             <a:fillRect/>
@@ -1388,7 +2205,7 @@
                     </pic:cNvPicPr>
                   </pic:nvPicPr>
                   <pic:blipFill>
-                    <a:blip r:embed="rId14" cstate="none"/>
+                    <a:blip r:embed="rId17" cstate="none"/>
                     <a:srcRect/>
                     <a:stretch>
                       <a:fillRect/>
@@ -1565,7 +2382,7 @@
                     </pic:cNvPicPr>
                   </pic:nvPicPr>
                   <pic:blipFill>
-                    <a:blip r:embed="rId15" cstate="none"/>
+                    <a:blip r:embed="rId18" cstate="none"/>
                     <a:srcRect/>
                     <a:stretch>
                       <a:fillRect/>
@@ -1611,7 +2428,7 @@
                     </pic:cNvPicPr>
                   </pic:nvPicPr>
                   <pic:blipFill>
-                    <a:blip r:embed="rId16" cstate="none"/>
+                    <a:blip r:embed="rId19" cstate="none"/>
                     <a:srcRect/>
                     <a:stretch>
                       <a:fillRect/>
@@ -1690,7 +2507,7 @@
                           </pic:cNvPicPr>
                         </pic:nvPicPr>
                         <pic:blipFill>
-                          <a:blip r:embed="rId17" cstate="none"/>
+                          <a:blip r:embed="rId20" cstate="none"/>
                           <a:srcRect/>
                           <a:stretch>
                             <a:fillRect/>
@@ -1763,7 +2580,7 @@
           <w:sz w:val="22"/>
           <w:szCs w:val="22"/>
         </w:rPr>
-        <w:t xml:space="preserve">Chaque centre ses données, ses utilisateurs, son paramétrage.</w:t>
+        <w:t xml:space="preserve">Chaque centre ses données, ses utilisateurs, son paramétrage ; une société pour les fédérer et une direction pour les piloter.</w:t>
       </w:r>
     </w:p>
     <w:p>

</xml_diff>